<commit_message>
aicionando novo arquivo com modificações lab 01
</commit_message>
<xml_diff>
--- a/Lab 1 - Definição de Projeto.docx
+++ b/Lab 1 - Definição de Projeto.docx
@@ -5,7 +5,6 @@
     <w:p>
       <w:pPr>
         <w:spacing w:line="240" w:lineRule="auto"/>
-        <w:jc w:val="center"/>
         <w:rPr>
           <w:rFonts w:ascii="Arial" w:hAnsi="Arial" w:cs="Arial"/>
           <w:b/>
@@ -47,63 +46,6 @@
         <w:jc w:val="both"/>
         <w:rPr>
           <w:rFonts w:ascii="Arial" w:hAnsi="Arial" w:cs="Arial"/>
-          <w:b/>
-          <w:bCs/>
-          <w:lang w:val="pt-BR"/>
-        </w:rPr>
-      </w:pPr>
-      <w:r>
-        <w:rPr>
-          <w:rFonts w:ascii="Arial" w:hAnsi="Arial" w:cs="Arial"/>
-          <w:b/>
-          <w:bCs/>
-          <w:lang w:val="pt-BR"/>
-        </w:rPr>
-        <w:t xml:space="preserve">OBS: </w:t>
-      </w:r>
-      <w:r>
-        <w:rPr>
-          <w:rFonts w:ascii="Arial" w:hAnsi="Arial" w:cs="Arial"/>
-          <w:b/>
-          <w:bCs/>
-          <w:lang w:val="pt-BR"/>
-        </w:rPr>
-        <w:t>Os</w:t>
-      </w:r>
-      <w:r>
-        <w:rPr>
-          <w:rFonts w:ascii="Arial" w:hAnsi="Arial" w:cs="Arial"/>
-          <w:b/>
-          <w:bCs/>
-          <w:lang w:val="pt-BR"/>
-        </w:rPr>
-        <w:t xml:space="preserve"> participantes </w:t>
-      </w:r>
-      <w:r>
-        <w:rPr>
-          <w:rFonts w:ascii="Arial" w:hAnsi="Arial" w:cs="Arial"/>
-          <w:b/>
-          <w:bCs/>
-          <w:lang w:val="pt-BR"/>
-        </w:rPr>
-        <w:t xml:space="preserve">em negrito </w:t>
-      </w:r>
-      <w:r>
-        <w:rPr>
-          <w:rFonts w:ascii="Arial" w:hAnsi="Arial" w:cs="Arial"/>
-          <w:b/>
-          <w:bCs/>
-          <w:lang w:val="pt-BR"/>
-        </w:rPr>
-        <w:t>ainda estão em fase de trocar de turma:</w:t>
-      </w:r>
-    </w:p>
-    <w:p>
-      <w:pPr>
-        <w:spacing w:line="240" w:lineRule="auto"/>
-        <w:jc w:val="both"/>
-        <w:rPr>
-          <w:rFonts w:ascii="Arial" w:hAnsi="Arial" w:cs="Arial"/>
           <w:lang w:val="pt-BR"/>
         </w:rPr>
       </w:pPr>
@@ -156,8 +98,6 @@
       <w:r>
         <w:rPr>
           <w:rFonts w:ascii="Arial" w:hAnsi="Arial" w:cs="Arial"/>
-          <w:b/>
-          <w:bCs/>
           <w:lang w:val="pt-BR"/>
         </w:rPr>
         <w:t xml:space="preserve">Rafaela </w:t>
@@ -166,8 +106,6 @@
       <w:r>
         <w:rPr>
           <w:rFonts w:ascii="Arial" w:hAnsi="Arial" w:cs="Arial"/>
-          <w:b/>
-          <w:bCs/>
           <w:lang w:val="pt-BR"/>
         </w:rPr>
         <w:t>Altheman</w:t>
@@ -176,8 +114,6 @@
       <w:r>
         <w:rPr>
           <w:rFonts w:ascii="Arial" w:hAnsi="Arial" w:cs="Arial"/>
-          <w:b/>
-          <w:bCs/>
           <w:lang w:val="pt-BR"/>
         </w:rPr>
         <w:t xml:space="preserve"> de Campos</w:t>
@@ -192,8 +128,6 @@
       <w:r>
         <w:rPr>
           <w:rFonts w:ascii="Arial" w:hAnsi="Arial" w:cs="Arial"/>
-          <w:b/>
-          <w:bCs/>
           <w:lang w:val="pt-BR"/>
         </w:rPr>
         <w:t xml:space="preserve">Beatriz </w:t>
@@ -202,8 +136,6 @@
       <w:r>
         <w:rPr>
           <w:rFonts w:ascii="Arial" w:hAnsi="Arial" w:cs="Arial"/>
-          <w:b/>
-          <w:bCs/>
           <w:lang w:val="pt-BR"/>
         </w:rPr>
         <w:t>Manaia</w:t>
@@ -212,8 +144,6 @@
       <w:r>
         <w:rPr>
           <w:rFonts w:ascii="Arial" w:hAnsi="Arial" w:cs="Arial"/>
-          <w:b/>
-          <w:bCs/>
           <w:lang w:val="pt-BR"/>
         </w:rPr>
         <w:t xml:space="preserve"> Lourenço Berto</w:t>
@@ -441,7 +371,43 @@
           <w:szCs w:val="24"/>
           <w:lang w:val="pt-BR"/>
         </w:rPr>
-        <w:t xml:space="preserve">Permite ter versatilidade de viagens; </w:t>
+        <w:t xml:space="preserve">Permite </w:t>
+      </w:r>
+      <w:r>
+        <w:rPr>
+          <w:rFonts w:ascii="Arial" w:hAnsi="Arial" w:cs="Arial"/>
+          <w:sz w:val="24"/>
+          <w:szCs w:val="24"/>
+          <w:lang w:val="pt-BR"/>
+        </w:rPr>
+        <w:t>diversas possibilidades</w:t>
+      </w:r>
+      <w:r>
+        <w:rPr>
+          <w:rFonts w:ascii="Arial" w:hAnsi="Arial" w:cs="Arial"/>
+          <w:sz w:val="24"/>
+          <w:szCs w:val="24"/>
+          <w:lang w:val="pt-BR"/>
+        </w:rPr>
+        <w:t xml:space="preserve"> de viagens</w:t>
+      </w:r>
+      <w:r>
+        <w:rPr>
+          <w:rFonts w:ascii="Arial" w:hAnsi="Arial" w:cs="Arial"/>
+          <w:sz w:val="24"/>
+          <w:szCs w:val="24"/>
+          <w:lang w:val="pt-BR"/>
+        </w:rPr>
+        <w:t xml:space="preserve"> em um único site</w:t>
+      </w:r>
+      <w:r>
+        <w:rPr>
+          <w:rFonts w:ascii="Arial" w:hAnsi="Arial" w:cs="Arial"/>
+          <w:sz w:val="24"/>
+          <w:szCs w:val="24"/>
+          <w:lang w:val="pt-BR"/>
+        </w:rPr>
+        <w:t xml:space="preserve">; </w:t>
       </w:r>
       <w:proofErr w:type="gramStart"/>
       <w:r>
@@ -624,7 +590,25 @@
           <w:szCs w:val="24"/>
           <w:lang w:val="pt-BR"/>
         </w:rPr>
-        <w:t xml:space="preserve"> +Oras</w:t>
+        <w:t xml:space="preserve"> </w:t>
+      </w:r>
+      <w:r>
+        <w:rPr>
+          <w:rFonts w:ascii="Arial" w:hAnsi="Arial" w:cs="Arial"/>
+          <w:sz w:val="24"/>
+          <w:szCs w:val="24"/>
+          <w:lang w:val="pt-BR"/>
+        </w:rPr>
+        <w:t>-Ho</w:t>
+      </w:r>
+      <w:r>
+        <w:rPr>
+          <w:rFonts w:ascii="Arial" w:hAnsi="Arial" w:cs="Arial"/>
+          <w:sz w:val="24"/>
+          <w:szCs w:val="24"/>
+          <w:lang w:val="pt-BR"/>
+        </w:rPr>
+        <w:t>ras</w:t>
       </w:r>
     </w:p>
     <w:p>
@@ -692,25 +676,7 @@
           <w:szCs w:val="24"/>
           <w:lang w:val="pt-BR"/>
         </w:rPr>
-        <w:t xml:space="preserve">: Dar a opção de navegar entre passagens aéreas </w:t>
-      </w:r>
-      <w:r>
-        <w:rPr>
-          <w:rFonts w:ascii="Arial" w:hAnsi="Arial" w:cs="Arial"/>
-          <w:sz w:val="24"/>
-          <w:szCs w:val="24"/>
-          <w:lang w:val="pt-BR"/>
-        </w:rPr>
-        <w:t>e marítima</w:t>
-      </w:r>
-      <w:r>
-        <w:rPr>
-          <w:rFonts w:ascii="Arial" w:hAnsi="Arial" w:cs="Arial"/>
-          <w:sz w:val="24"/>
-          <w:szCs w:val="24"/>
-          <w:lang w:val="pt-BR"/>
-        </w:rPr>
-        <w:t>s;</w:t>
+        <w:t>: Dar a opção de navegar entre passagens aéreas e marítimas;</w:t>
       </w:r>
       <w:r>
         <w:rPr>
@@ -903,6 +869,20 @@
         </w:rPr>
         <w:t>Para cada processo, descrever:</w:t>
       </w:r>
+    </w:p>
+    <w:p>
+      <w:pPr>
+        <w:spacing w:line="240" w:lineRule="auto"/>
+        <w:jc w:val="both"/>
+        <w:rPr>
+          <w:rFonts w:ascii="Arial" w:hAnsi="Arial" w:cs="Arial"/>
+          <w:b/>
+          <w:bCs/>
+          <w:sz w:val="24"/>
+          <w:szCs w:val="24"/>
+          <w:lang w:val="pt-BR"/>
+        </w:rPr>
+      </w:pPr>
     </w:p>
     <w:p>
       <w:pPr>
@@ -935,7 +915,7 @@
           <w:szCs w:val="24"/>
           <w:lang w:val="pt-BR"/>
         </w:rPr>
-        <w:t>: Pagamento por cartão</w:t>
+        <w:t>: Cadastro</w:t>
       </w:r>
     </w:p>
     <w:p>
@@ -969,7 +949,7 @@
           <w:szCs w:val="24"/>
           <w:lang w:val="pt-BR"/>
         </w:rPr>
-        <w:t>: Dados do cartão, endereço do pagamento, bandeira do cartão.</w:t>
+        <w:t>: Dados pessoais: CPF, Nome, CEP, Senha, e-mail</w:t>
       </w:r>
     </w:p>
     <w:p>
@@ -1003,7 +983,7 @@
           <w:szCs w:val="24"/>
           <w:lang w:val="pt-BR"/>
         </w:rPr>
-        <w:t>: Transação concluída.</w:t>
+        <w:t xml:space="preserve">: Usuário cadastrado </w:t>
       </w:r>
     </w:p>
     <w:p>
@@ -1085,16 +1065,7 @@
           <w:szCs w:val="24"/>
           <w:lang w:val="pt-BR"/>
         </w:rPr>
-        <w:t>:</w:t>
-      </w:r>
-      <w:r>
-        <w:rPr>
-          <w:rFonts w:ascii="Arial" w:hAnsi="Arial" w:cs="Arial"/>
-          <w:sz w:val="24"/>
-          <w:szCs w:val="24"/>
-          <w:lang w:val="pt-BR"/>
-        </w:rPr>
-        <w:t xml:space="preserve"> Cadastro</w:t>
+        <w:t>: Login</w:t>
       </w:r>
     </w:p>
     <w:p>
@@ -1119,25 +1090,7 @@
           <w:szCs w:val="24"/>
           <w:lang w:val="pt-BR"/>
         </w:rPr>
-        <w:t>Entrada</w:t>
-      </w:r>
-      <w:r>
-        <w:rPr>
-          <w:rFonts w:ascii="Arial" w:hAnsi="Arial" w:cs="Arial"/>
-          <w:sz w:val="24"/>
-          <w:szCs w:val="24"/>
-          <w:lang w:val="pt-BR"/>
-        </w:rPr>
-        <w:t xml:space="preserve">: </w:t>
-      </w:r>
-      <w:r>
-        <w:rPr>
-          <w:rFonts w:ascii="Arial" w:hAnsi="Arial" w:cs="Arial"/>
-          <w:sz w:val="24"/>
-          <w:szCs w:val="24"/>
-          <w:lang w:val="pt-BR"/>
-        </w:rPr>
-        <w:t>Dados pessoais: CPF, Nome, CEP, Senha, e-mail</w:t>
+        <w:t>Entrada: CPF e senha</w:t>
       </w:r>
     </w:p>
     <w:p>
@@ -1162,25 +1115,7 @@
           <w:szCs w:val="24"/>
           <w:lang w:val="pt-BR"/>
         </w:rPr>
-        <w:t>Saída</w:t>
-      </w:r>
-      <w:r>
-        <w:rPr>
-          <w:rFonts w:ascii="Arial" w:hAnsi="Arial" w:cs="Arial"/>
-          <w:sz w:val="24"/>
-          <w:szCs w:val="24"/>
-          <w:lang w:val="pt-BR"/>
-        </w:rPr>
-        <w:t xml:space="preserve">: </w:t>
-      </w:r>
-      <w:r>
-        <w:rPr>
-          <w:rFonts w:ascii="Arial" w:hAnsi="Arial" w:cs="Arial"/>
-          <w:sz w:val="24"/>
-          <w:szCs w:val="24"/>
-          <w:lang w:val="pt-BR"/>
-        </w:rPr>
-        <w:t xml:space="preserve">Usuário cadastrado </w:t>
+        <w:t>Saída: Acesso a plataforma</w:t>
       </w:r>
     </w:p>
     <w:p>
@@ -1205,6 +1140,191 @@
           <w:szCs w:val="24"/>
           <w:lang w:val="pt-BR"/>
         </w:rPr>
+        <w:t>Atores envolvidos: Usuário final</w:t>
+      </w:r>
+    </w:p>
+    <w:p>
+      <w:pPr>
+        <w:spacing w:line="240" w:lineRule="auto"/>
+        <w:ind w:left="720"/>
+        <w:jc w:val="both"/>
+        <w:rPr>
+          <w:rFonts w:ascii="Arial" w:hAnsi="Arial" w:cs="Arial"/>
+          <w:sz w:val="24"/>
+          <w:szCs w:val="24"/>
+          <w:lang w:val="pt-BR"/>
+        </w:rPr>
+      </w:pPr>
+    </w:p>
+    <w:p>
+      <w:pPr>
+        <w:numPr>
+          <w:ilvl w:val="0"/>
+          <w:numId w:val="21"/>
+        </w:numPr>
+        <w:spacing w:line="240" w:lineRule="auto"/>
+        <w:jc w:val="both"/>
+        <w:rPr>
+          <w:rFonts w:ascii="Arial" w:hAnsi="Arial" w:cs="Arial"/>
+          <w:sz w:val="24"/>
+          <w:szCs w:val="24"/>
+          <w:lang w:val="pt-BR"/>
+        </w:rPr>
+      </w:pPr>
+      <w:r>
+        <w:rPr>
+          <w:rFonts w:ascii="Arial" w:hAnsi="Arial" w:cs="Arial"/>
+          <w:sz w:val="24"/>
+          <w:szCs w:val="24"/>
+          <w:lang w:val="pt-BR"/>
+        </w:rPr>
+        <w:t>Nome do processo</w:t>
+      </w:r>
+      <w:r>
+        <w:rPr>
+          <w:rFonts w:ascii="Arial" w:hAnsi="Arial" w:cs="Arial"/>
+          <w:sz w:val="24"/>
+          <w:szCs w:val="24"/>
+          <w:lang w:val="pt-BR"/>
+        </w:rPr>
+        <w:t xml:space="preserve">: </w:t>
+      </w:r>
+      <w:r>
+        <w:rPr>
+          <w:rFonts w:ascii="Arial" w:hAnsi="Arial" w:cs="Arial"/>
+          <w:sz w:val="24"/>
+          <w:szCs w:val="24"/>
+          <w:lang w:val="pt-BR"/>
+        </w:rPr>
+        <w:t>Compra de passagem</w:t>
+      </w:r>
+    </w:p>
+    <w:p>
+      <w:pPr>
+        <w:numPr>
+          <w:ilvl w:val="0"/>
+          <w:numId w:val="21"/>
+        </w:numPr>
+        <w:spacing w:line="240" w:lineRule="auto"/>
+        <w:jc w:val="both"/>
+        <w:rPr>
+          <w:rFonts w:ascii="Arial" w:hAnsi="Arial" w:cs="Arial"/>
+          <w:sz w:val="24"/>
+          <w:szCs w:val="24"/>
+          <w:lang w:val="pt-BR"/>
+        </w:rPr>
+      </w:pPr>
+      <w:r>
+        <w:rPr>
+          <w:rFonts w:ascii="Arial" w:hAnsi="Arial" w:cs="Arial"/>
+          <w:sz w:val="24"/>
+          <w:szCs w:val="24"/>
+          <w:lang w:val="pt-BR"/>
+        </w:rPr>
+        <w:t>Entrada</w:t>
+      </w:r>
+      <w:r>
+        <w:rPr>
+          <w:rFonts w:ascii="Arial" w:hAnsi="Arial" w:cs="Arial"/>
+          <w:sz w:val="24"/>
+          <w:szCs w:val="24"/>
+          <w:lang w:val="pt-BR"/>
+        </w:rPr>
+        <w:t>:</w:t>
+      </w:r>
+      <w:r>
+        <w:rPr>
+          <w:rFonts w:ascii="Arial" w:hAnsi="Arial" w:cs="Arial"/>
+          <w:sz w:val="24"/>
+          <w:szCs w:val="24"/>
+          <w:lang w:val="pt-BR"/>
+        </w:rPr>
+        <w:t xml:space="preserve"> Escolha de passagem, suas especificações e quantidade</w:t>
+      </w:r>
+      <w:r>
+        <w:rPr>
+          <w:rFonts w:ascii="Arial" w:hAnsi="Arial" w:cs="Arial"/>
+          <w:sz w:val="24"/>
+          <w:szCs w:val="24"/>
+          <w:lang w:val="pt-BR"/>
+        </w:rPr>
+        <w:t>.</w:t>
+      </w:r>
+    </w:p>
+    <w:p>
+      <w:pPr>
+        <w:numPr>
+          <w:ilvl w:val="0"/>
+          <w:numId w:val="21"/>
+        </w:numPr>
+        <w:spacing w:line="240" w:lineRule="auto"/>
+        <w:jc w:val="both"/>
+        <w:rPr>
+          <w:rFonts w:ascii="Arial" w:hAnsi="Arial" w:cs="Arial"/>
+          <w:sz w:val="24"/>
+          <w:szCs w:val="24"/>
+          <w:lang w:val="pt-BR"/>
+        </w:rPr>
+      </w:pPr>
+      <w:r>
+        <w:rPr>
+          <w:rFonts w:ascii="Arial" w:hAnsi="Arial" w:cs="Arial"/>
+          <w:sz w:val="24"/>
+          <w:szCs w:val="24"/>
+          <w:lang w:val="pt-BR"/>
+        </w:rPr>
+        <w:t>Saída</w:t>
+      </w:r>
+      <w:r>
+        <w:rPr>
+          <w:rFonts w:ascii="Arial" w:hAnsi="Arial" w:cs="Arial"/>
+          <w:sz w:val="24"/>
+          <w:szCs w:val="24"/>
+          <w:lang w:val="pt-BR"/>
+        </w:rPr>
+        <w:t xml:space="preserve">: </w:t>
+      </w:r>
+      <w:r>
+        <w:rPr>
+          <w:rFonts w:ascii="Arial" w:hAnsi="Arial" w:cs="Arial"/>
+          <w:sz w:val="24"/>
+          <w:szCs w:val="24"/>
+          <w:lang w:val="pt-BR"/>
+        </w:rPr>
+        <w:t>Passagem adicionada no carrinho</w:t>
+      </w:r>
+      <w:r>
+        <w:rPr>
+          <w:rFonts w:ascii="Arial" w:hAnsi="Arial" w:cs="Arial"/>
+          <w:sz w:val="24"/>
+          <w:szCs w:val="24"/>
+          <w:lang w:val="pt-BR"/>
+        </w:rPr>
+        <w:t>.</w:t>
+      </w:r>
+    </w:p>
+    <w:p>
+      <w:pPr>
+        <w:numPr>
+          <w:ilvl w:val="0"/>
+          <w:numId w:val="21"/>
+        </w:numPr>
+        <w:spacing w:line="240" w:lineRule="auto"/>
+        <w:jc w:val="both"/>
+        <w:rPr>
+          <w:rFonts w:ascii="Arial" w:hAnsi="Arial" w:cs="Arial"/>
+          <w:sz w:val="24"/>
+          <w:szCs w:val="24"/>
+          <w:lang w:val="pt-BR"/>
+        </w:rPr>
+      </w:pPr>
+      <w:r>
+        <w:rPr>
+          <w:rFonts w:ascii="Arial" w:hAnsi="Arial" w:cs="Arial"/>
+          <w:sz w:val="24"/>
+          <w:szCs w:val="24"/>
+          <w:lang w:val="pt-BR"/>
+        </w:rPr>
         <w:t>Atores envolvidos</w:t>
       </w:r>
       <w:r>
@@ -1214,26 +1334,16 @@
           <w:szCs w:val="24"/>
           <w:lang w:val="pt-BR"/>
         </w:rPr>
-        <w:t xml:space="preserve">: </w:t>
-      </w:r>
-      <w:r>
-        <w:rPr>
-          <w:rFonts w:ascii="Arial" w:hAnsi="Arial" w:cs="Arial"/>
-          <w:sz w:val="24"/>
-          <w:szCs w:val="24"/>
-          <w:lang w:val="pt-BR"/>
-        </w:rPr>
-        <w:t>Usuário final</w:t>
+        <w:t>: Usuário final</w:t>
       </w:r>
     </w:p>
     <w:p>
       <w:pPr>
         <w:spacing w:line="240" w:lineRule="auto"/>
+        <w:ind w:left="720"/>
         <w:jc w:val="both"/>
         <w:rPr>
           <w:rFonts w:ascii="Arial" w:hAnsi="Arial" w:cs="Arial"/>
-          <w:b/>
-          <w:bCs/>
           <w:sz w:val="24"/>
           <w:szCs w:val="24"/>
           <w:lang w:val="pt-BR"/>
@@ -1271,16 +1381,7 @@
           <w:szCs w:val="24"/>
           <w:lang w:val="pt-BR"/>
         </w:rPr>
-        <w:t xml:space="preserve">: </w:t>
-      </w:r>
-      <w:r>
-        <w:rPr>
-          <w:rFonts w:ascii="Arial" w:hAnsi="Arial" w:cs="Arial"/>
-          <w:sz w:val="24"/>
-          <w:szCs w:val="24"/>
-          <w:lang w:val="pt-BR"/>
-        </w:rPr>
-        <w:t>Login</w:t>
+        <w:t>: Pagamento por cartão</w:t>
       </w:r>
     </w:p>
     <w:p>
@@ -1314,16 +1415,7 @@
           <w:szCs w:val="24"/>
           <w:lang w:val="pt-BR"/>
         </w:rPr>
-        <w:t xml:space="preserve">: </w:t>
-      </w:r>
-      <w:r>
-        <w:rPr>
-          <w:rFonts w:ascii="Arial" w:hAnsi="Arial" w:cs="Arial"/>
-          <w:sz w:val="24"/>
-          <w:szCs w:val="24"/>
-          <w:lang w:val="pt-BR"/>
-        </w:rPr>
-        <w:t>CPF e senha</w:t>
+        <w:t>: Dados do cartão, endereço do pagamento, bandeira do cartão.</w:t>
       </w:r>
     </w:p>
     <w:p>
@@ -1357,16 +1449,7 @@
           <w:szCs w:val="24"/>
           <w:lang w:val="pt-BR"/>
         </w:rPr>
-        <w:t xml:space="preserve">: </w:t>
-      </w:r>
-      <w:r>
-        <w:rPr>
-          <w:rFonts w:ascii="Arial" w:hAnsi="Arial" w:cs="Arial"/>
-          <w:sz w:val="24"/>
-          <w:szCs w:val="24"/>
-          <w:lang w:val="pt-BR"/>
-        </w:rPr>
-        <w:t>Acesso a plataforma</w:t>
+        <w:t>: Transação concluída.</w:t>
       </w:r>
     </w:p>
     <w:p>
@@ -1439,6 +1522,7 @@
           <w:szCs w:val="24"/>
           <w:lang w:val="pt-BR"/>
         </w:rPr>
+        <w:lastRenderedPageBreak/>
         <w:t>5</w:t>
       </w:r>
       <w:r>
@@ -1487,7 +1571,6 @@
           <w:szCs w:val="24"/>
           <w:lang w:val="pt-BR"/>
         </w:rPr>
-        <w:lastRenderedPageBreak/>
         <w:drawing>
           <wp:inline distT="0" distB="0" distL="0" distR="0" wp14:anchorId="5F727328" wp14:editId="11CBE653">
             <wp:extent cx="5486400" cy="2063115"/>
@@ -1603,11 +1686,71 @@
           <w:rFonts w:ascii="Arial" w:hAnsi="Arial" w:cs="Arial"/>
           <w:b/>
           <w:bCs/>
+          <w:sz w:val="24"/>
+          <w:szCs w:val="24"/>
+          <w:lang w:val="pt-BR"/>
+        </w:rPr>
+        <w:drawing>
+          <wp:inline distT="0" distB="0" distL="0" distR="0" wp14:anchorId="09021C16" wp14:editId="3993C3F8">
+            <wp:extent cx="5486400" cy="1534160"/>
+            <wp:effectExtent l="0" t="0" r="0" b="8890"/>
+            <wp:docPr id="1" name="Imagem 1"/>
+            <wp:cNvGraphicFramePr>
+              <a:graphicFrameLocks xmlns:a="http://schemas.openxmlformats.org/drawingml/2006/main" noChangeAspect="1"/>
+            </wp:cNvGraphicFramePr>
+            <a:graphic xmlns:a="http://schemas.openxmlformats.org/drawingml/2006/main">
+              <a:graphicData uri="http://schemas.openxmlformats.org/drawingml/2006/picture">
+                <pic:pic xmlns:pic="http://schemas.openxmlformats.org/drawingml/2006/picture">
+                  <pic:nvPicPr>
+                    <pic:cNvPr id="1" name=""/>
+                    <pic:cNvPicPr/>
+                  </pic:nvPicPr>
+                  <pic:blipFill>
+                    <a:blip r:embed="rId10"/>
+                    <a:stretch>
+                      <a:fillRect/>
+                    </a:stretch>
+                  </pic:blipFill>
+                  <pic:spPr>
+                    <a:xfrm>
+                      <a:off x="0" y="0"/>
+                      <a:ext cx="5486400" cy="1534160"/>
+                    </a:xfrm>
+                    <a:prstGeom prst="rect">
+                      <a:avLst/>
+                    </a:prstGeom>
+                  </pic:spPr>
+                </pic:pic>
+              </a:graphicData>
+            </a:graphic>
+          </wp:inline>
+        </w:drawing>
+      </w:r>
+    </w:p>
+    <w:p>
+      <w:pPr>
+        <w:spacing w:line="240" w:lineRule="auto"/>
+        <w:jc w:val="both"/>
+        <w:rPr>
+          <w:rFonts w:ascii="Arial" w:hAnsi="Arial" w:cs="Arial"/>
+          <w:b/>
+          <w:bCs/>
+          <w:sz w:val="24"/>
+          <w:szCs w:val="24"/>
+          <w:lang w:val="pt-BR"/>
+        </w:rPr>
+      </w:pPr>
+      <w:r>
+        <w:rPr>
+          <w:rFonts w:ascii="Arial" w:hAnsi="Arial" w:cs="Arial"/>
+          <w:b/>
+          <w:bCs/>
           <w:noProof/>
           <w:sz w:val="24"/>
           <w:szCs w:val="24"/>
           <w:lang w:val="pt-BR"/>
         </w:rPr>
+        <w:lastRenderedPageBreak/>
         <w:drawing>
           <wp:inline distT="0" distB="0" distL="0" distR="0" wp14:anchorId="085F91EB" wp14:editId="0E934928">
             <wp:extent cx="5486400" cy="2084705"/>
@@ -1624,7 +1767,7 @@
                     <pic:cNvPicPr/>
                   </pic:nvPicPr>
                   <pic:blipFill>
-                    <a:blip r:embed="rId10"/>
+                    <a:blip r:embed="rId11"/>
                     <a:stretch>
                       <a:fillRect/>
                     </a:stretch>
@@ -1810,7 +1953,7 @@
           <w:lang w:val="pt-BR"/>
         </w:rPr>
       </w:pPr>
-      <w:hyperlink r:id="rId11" w:history="1">
+      <w:hyperlink r:id="rId12" w:history="1">
         <w:r>
           <w:rPr>
             <w:rStyle w:val="Hyperlink"/>
@@ -1833,7 +1976,7 @@
       </w:r>
     </w:p>
     <w:sectPr>
-      <w:headerReference w:type="default" r:id="rId12"/>
+      <w:headerReference w:type="default" r:id="rId13"/>
       <w:pgSz w:w="12240" w:h="15840"/>
       <w:pgMar w:top="1440" w:right="1800" w:bottom="1440" w:left="1800" w:header="720" w:footer="720" w:gutter="0"/>
       <w:cols w:space="720"/>
@@ -2631,6 +2774,119 @@
     </w:lvl>
   </w:abstractNum>
   <w:abstractNum w:abstractNumId="13" w15:restartNumberingAfterBreak="0">
+    <w:nsid w:val="25770C4C"/>
+    <w:multiLevelType w:val="hybridMultilevel"/>
+    <w:tmpl w:val="E9E0C452"/>
+    <w:lvl w:ilvl="0" w:tplc="04160001">
+      <w:start w:val="1"/>
+      <w:numFmt w:val="bullet"/>
+      <w:lvlText w:val=""/>
+      <w:lvlJc w:val="left"/>
+      <w:pPr>
+        <w:ind w:left="720" w:hanging="360"/>
+      </w:pPr>
+      <w:rPr>
+        <w:rFonts w:ascii="Symbol" w:hAnsi="Symbol" w:hint="default"/>
+      </w:rPr>
+    </w:lvl>
+    <w:lvl w:ilvl="1" w:tplc="04160003" w:tentative="1">
+      <w:start w:val="1"/>
+      <w:numFmt w:val="bullet"/>
+      <w:lvlText w:val="o"/>
+      <w:lvlJc w:val="left"/>
+      <w:pPr>
+        <w:ind w:left="1440" w:hanging="360"/>
+      </w:pPr>
+      <w:rPr>
+        <w:rFonts w:ascii="Courier New" w:hAnsi="Courier New" w:cs="Courier New" w:hint="default"/>
+      </w:rPr>
+    </w:lvl>
+    <w:lvl w:ilvl="2" w:tplc="04160005" w:tentative="1">
+      <w:start w:val="1"/>
+      <w:numFmt w:val="bullet"/>
+      <w:lvlText w:val=""/>
+      <w:lvlJc w:val="left"/>
+      <w:pPr>
+        <w:ind w:left="2160" w:hanging="360"/>
+      </w:pPr>
+      <w:rPr>
+        <w:rFonts w:ascii="Wingdings" w:hAnsi="Wingdings" w:hint="default"/>
+      </w:rPr>
+    </w:lvl>
+    <w:lvl w:ilvl="3" w:tplc="04160001" w:tentative="1">
+      <w:start w:val="1"/>
+      <w:numFmt w:val="bullet"/>
+      <w:lvlText w:val=""/>
+      <w:lvlJc w:val="left"/>
+      <w:pPr>
+        <w:ind w:left="2880" w:hanging="360"/>
+      </w:pPr>
+      <w:rPr>
+        <w:rFonts w:ascii="Symbol" w:hAnsi="Symbol" w:hint="default"/>
+      </w:rPr>
+    </w:lvl>
+    <w:lvl w:ilvl="4" w:tplc="04160003" w:tentative="1">
+      <w:start w:val="1"/>
+      <w:numFmt w:val="bullet"/>
+      <w:lvlText w:val="o"/>
+      <w:lvlJc w:val="left"/>
+      <w:pPr>
+        <w:ind w:left="3600" w:hanging="360"/>
+      </w:pPr>
+      <w:rPr>
+        <w:rFonts w:ascii="Courier New" w:hAnsi="Courier New" w:cs="Courier New" w:hint="default"/>
+      </w:rPr>
+    </w:lvl>
+    <w:lvl w:ilvl="5" w:tplc="04160005" w:tentative="1">
+      <w:start w:val="1"/>
+      <w:numFmt w:val="bullet"/>
+      <w:lvlText w:val=""/>
+      <w:lvlJc w:val="left"/>
+      <w:pPr>
+        <w:ind w:left="4320" w:hanging="360"/>
+      </w:pPr>
+      <w:rPr>
+        <w:rFonts w:ascii="Wingdings" w:hAnsi="Wingdings" w:hint="default"/>
+      </w:rPr>
+    </w:lvl>
+    <w:lvl w:ilvl="6" w:tplc="04160001" w:tentative="1">
+      <w:start w:val="1"/>
+      <w:numFmt w:val="bullet"/>
+      <w:lvlText w:val=""/>
+      <w:lvlJc w:val="left"/>
+      <w:pPr>
+        <w:ind w:left="5040" w:hanging="360"/>
+      </w:pPr>
+      <w:rPr>
+        <w:rFonts w:ascii="Symbol" w:hAnsi="Symbol" w:hint="default"/>
+      </w:rPr>
+    </w:lvl>
+    <w:lvl w:ilvl="7" w:tplc="04160003" w:tentative="1">
+      <w:start w:val="1"/>
+      <w:numFmt w:val="bullet"/>
+      <w:lvlText w:val="o"/>
+      <w:lvlJc w:val="left"/>
+      <w:pPr>
+        <w:ind w:left="5760" w:hanging="360"/>
+      </w:pPr>
+      <w:rPr>
+        <w:rFonts w:ascii="Courier New" w:hAnsi="Courier New" w:cs="Courier New" w:hint="default"/>
+      </w:rPr>
+    </w:lvl>
+    <w:lvl w:ilvl="8" w:tplc="04160005" w:tentative="1">
+      <w:start w:val="1"/>
+      <w:numFmt w:val="bullet"/>
+      <w:lvlText w:val=""/>
+      <w:lvlJc w:val="left"/>
+      <w:pPr>
+        <w:ind w:left="6480" w:hanging="360"/>
+      </w:pPr>
+      <w:rPr>
+        <w:rFonts w:ascii="Wingdings" w:hAnsi="Wingdings" w:hint="default"/>
+      </w:rPr>
+    </w:lvl>
+  </w:abstractNum>
+  <w:abstractNum w:abstractNumId="14" w15:restartNumberingAfterBreak="0">
     <w:nsid w:val="3CF3748B"/>
     <w:multiLevelType w:val="multilevel"/>
     <w:tmpl w:val="8AB82652"/>
@@ -2779,7 +3035,7 @@
       </w:rPr>
     </w:lvl>
   </w:abstractNum>
-  <w:abstractNum w:abstractNumId="14" w15:restartNumberingAfterBreak="0">
+  <w:abstractNum w:abstractNumId="15" w15:restartNumberingAfterBreak="0">
     <w:nsid w:val="600F6EB2"/>
     <w:multiLevelType w:val="multilevel"/>
     <w:tmpl w:val="DA7A0E6C"/>
@@ -2928,7 +3184,7 @@
       </w:rPr>
     </w:lvl>
   </w:abstractNum>
-  <w:abstractNum w:abstractNumId="15" w15:restartNumberingAfterBreak="0">
+  <w:abstractNum w:abstractNumId="16" w15:restartNumberingAfterBreak="0">
     <w:nsid w:val="66535B6D"/>
     <w:multiLevelType w:val="multilevel"/>
     <w:tmpl w:val="4B3807F6"/>
@@ -3077,7 +3333,7 @@
       </w:rPr>
     </w:lvl>
   </w:abstractNum>
-  <w:abstractNum w:abstractNumId="16" w15:restartNumberingAfterBreak="0">
+  <w:abstractNum w:abstractNumId="17" w15:restartNumberingAfterBreak="0">
     <w:nsid w:val="6C960AE3"/>
     <w:multiLevelType w:val="multilevel"/>
     <w:tmpl w:val="974A94FC"/>
@@ -3226,7 +3482,7 @@
       </w:rPr>
     </w:lvl>
   </w:abstractNum>
-  <w:abstractNum w:abstractNumId="17" w15:restartNumberingAfterBreak="0">
+  <w:abstractNum w:abstractNumId="18" w15:restartNumberingAfterBreak="0">
     <w:nsid w:val="72493D3B"/>
     <w:multiLevelType w:val="multilevel"/>
     <w:tmpl w:val="8BE0ABAA"/>
@@ -3375,7 +3631,7 @@
       </w:rPr>
     </w:lvl>
   </w:abstractNum>
-  <w:abstractNum w:abstractNumId="18" w15:restartNumberingAfterBreak="0">
+  <w:abstractNum w:abstractNumId="19" w15:restartNumberingAfterBreak="0">
     <w:nsid w:val="7C8A7CD3"/>
     <w:multiLevelType w:val="hybridMultilevel"/>
     <w:tmpl w:val="03BCA032"/>
@@ -3461,7 +3717,7 @@
       </w:pPr>
     </w:lvl>
   </w:abstractNum>
-  <w:abstractNum w:abstractNumId="19" w15:restartNumberingAfterBreak="0">
+  <w:abstractNum w:abstractNumId="20" w15:restartNumberingAfterBreak="0">
     <w:nsid w:val="7F861688"/>
     <w:multiLevelType w:val="multilevel"/>
     <w:tmpl w:val="11BCA1B6"/>
@@ -3638,7 +3894,7 @@
     <w:abstractNumId w:val="0"/>
   </w:num>
   <w:num w:numId="10">
-    <w:abstractNumId w:val="18"/>
+    <w:abstractNumId w:val="19"/>
   </w:num>
   <w:num w:numId="11">
     <w:abstractNumId w:val="11"/>
@@ -3647,28 +3903,31 @@
     <w:abstractNumId w:val="9"/>
   </w:num>
   <w:num w:numId="13">
-    <w:abstractNumId w:val="17"/>
+    <w:abstractNumId w:val="18"/>
   </w:num>
   <w:num w:numId="14">
-    <w:abstractNumId w:val="13"/>
+    <w:abstractNumId w:val="14"/>
   </w:num>
   <w:num w:numId="15">
+    <w:abstractNumId w:val="16"/>
+  </w:num>
+  <w:num w:numId="16">
     <w:abstractNumId w:val="15"/>
   </w:num>
-  <w:num w:numId="16">
-    <w:abstractNumId w:val="14"/>
-  </w:num>
   <w:num w:numId="17">
-    <w:abstractNumId w:val="16"/>
+    <w:abstractNumId w:val="17"/>
   </w:num>
   <w:num w:numId="18">
     <w:abstractNumId w:val="12"/>
   </w:num>
   <w:num w:numId="19">
-    <w:abstractNumId w:val="19"/>
+    <w:abstractNumId w:val="20"/>
   </w:num>
   <w:num w:numId="20">
     <w:abstractNumId w:val="10"/>
+  </w:num>
+  <w:num w:numId="21">
+    <w:abstractNumId w:val="13"/>
   </w:num>
 </w:numbering>
 </file>

</xml_diff>